<commit_message>
docs(avg): vraag 9 groepsstructuur + concept-verwerkersovereenkomst PDL; jurist-akkoord 2026-08-12 geregistreerd
- Toetsingsmemo: vraag 9 toegevoegd (kantoor = verwerkingsverantwoordelijke,
  PDL Powerhouse = hosting-/softwareverwerker — volstaat een intra-groep
  verwerkersovereenkomst?), Word-bundel bijgewerkt.
- Concept intra-groep verwerkersovereenkomst kantoor ↔ PDL (07 + docx):
  Google Cloud als subverwerker ván PDL; invulpunt bij ondertekening als
  Anthropic/Reeleezee-accounts feitelijk op naam van PDL staan.
- BESLISSINGEN: jurist-akkoord 2026-08-12 geregistreerd — AVG-compliance
  getoetst/akkoord, alle 9 vragen; de activatie-checklist (docs/avg/05) is nu
  de operationele leidraad voor de poorten (AI-extractie, F5-poort GCP).

Co-Authored-By: Claude Fable 5 <noreply@anthropic.com>
</commit_message>
<xml_diff>
--- a/docs/avg/AVG-pakket-ter-toetsing-2026-08-11.docx
+++ b/docs/avg/AVG-pakket-ter-toetsing-2026-08-11.docx
@@ -441,6 +441,47 @@
       </w:r>
       <w:r>
         <w:t xml:space="preserve">geheimhoudingsbedingen personeel)?</w:t>
+      </w:r>
+    </w:p>
+    <w:p>
+      <w:pPr>
+        <w:pStyle w:val="BodyText"/>
+      </w:pPr>
+      <w:r>
+        <w:rPr>
+          <w:b/>
+        </w:rPr>
+        <w:t xml:space="preserve">Vraag 9 (groepsstructuur).</w:t>
+      </w:r>
+      <w:r>
+        <w:t xml:space="preserve"> </w:t>
+      </w:r>
+      <w:r>
+        <w:t xml:space="preserve">De software en de hosting (Google Cloud-organisatie) zijn</w:t>
+      </w:r>
+      <w:r>
+        <w:t xml:space="preserve"> </w:t>
+      </w:r>
+      <w:r>
+        <w:t xml:space="preserve">eigendom van PDL Powerhouse B.V.; de verwerkingsverantwoordelijke voor de klantdata is het</w:t>
+      </w:r>
+      <w:r>
+        <w:t xml:space="preserve"> </w:t>
+      </w:r>
+      <w:r>
+        <w:t xml:space="preserve">kantoor. Als kantoor en PDL verschillende rechtspersonen zijn: volstaat een intra-groep</w:t>
+      </w:r>
+      <w:r>
+        <w:t xml:space="preserve"> </w:t>
+      </w:r>
+      <w:r>
+        <w:t xml:space="preserve">verwerkersovereenkomst tussen kantoor en PDL (PDL als hosting-/softwareverwerker), en heeft u</w:t>
+      </w:r>
+      <w:r>
+        <w:t xml:space="preserve"> </w:t>
+      </w:r>
+      <w:r>
+        <w:t xml:space="preserve">daar een modeltekst voor? Zo ja, dan hoort PDL ook als verwerker in het register (document 1).</w:t>
       </w:r>
     </w:p>
     <w:p>

</xml_diff>